<commit_message>
feat: add the first model class
</commit_message>
<xml_diff>
--- a/51PM Projektuvannja modeluvannja/1/PM_KNT-122_Onyshchenko_19_PR1.docx
+++ b/51PM Projektuvannja modeluvannja/1/PM_KNT-122_Onyshchenko_19_PR1.docx
@@ -412,12 +412,21 @@
     </w:p>
     <w:p>
       <w:pPr>
+        <w:pStyle w:val="h11"/>
+        <w:rPr/>
+      </w:pPr>
+      <w:r>
+        <w:rPr/>
+        <w:t>Мета</w:t>
+      </w:r>
+    </w:p>
+    <w:p>
+      <w:pPr>
         <w:pStyle w:val="P1"/>
         <w:rPr/>
       </w:pPr>
       <w:r>
         <w:rPr/>
-        <w:t>Мета</w:t>
       </w:r>
     </w:p>
     <w:p>
@@ -427,82 +436,102 @@
       </w:pPr>
       <w:r>
         <w:rPr/>
+        <w:t xml:space="preserve">Ознайомитися </w:t>
+      </w:r>
+      <w:r>
+        <w:rPr/>
+        <w:t xml:space="preserve">із основними можливостям фреймворку </w:t>
+      </w:r>
+      <w:r>
+        <w:rPr>
+          <w:lang w:val="en-US"/>
+        </w:rPr>
+        <w:t xml:space="preserve">Django, </w:t>
+      </w:r>
+      <w:r>
+        <w:rPr>
+          <w:lang w:val="uk-UA"/>
+        </w:rPr>
+        <w:t xml:space="preserve">навчитися створювати та запускати проєкти із використанням утиліти </w:t>
+      </w:r>
+      <w:r>
+        <w:rPr>
+          <w:lang w:val="en-US"/>
+        </w:rPr>
+        <w:t xml:space="preserve">Supervisor </w:t>
+      </w:r>
+      <w:r>
+        <w:rPr>
+          <w:lang w:val="uk-UA"/>
+        </w:rPr>
+        <w:t xml:space="preserve">та </w:t>
+      </w:r>
+      <w:r>
+        <w:rPr>
+          <w:lang w:val="en-US"/>
+        </w:rPr>
+        <w:t xml:space="preserve">Nginx </w:t>
+      </w:r>
+      <w:r>
+        <w:rPr>
+          <w:lang w:val="uk-UA"/>
+        </w:rPr>
+        <w:t>сервера.</w:t>
       </w:r>
     </w:p>
     <w:p>
       <w:pPr>
         <w:pStyle w:val="P1"/>
-        <w:rPr/>
-      </w:pPr>
-      <w:r>
-        <w:rPr/>
-        <w:t xml:space="preserve">Ознайомитися </w:t>
-      </w:r>
-      <w:r>
-        <w:rPr/>
-        <w:t xml:space="preserve">із основними можливостям фреймворку </w:t>
-      </w:r>
-      <w:r>
-        <w:rPr>
-          <w:lang w:val="en-US"/>
-        </w:rPr>
-        <w:t xml:space="preserve">Django, </w:t>
-      </w:r>
-      <w:r>
         <w:rPr>
           <w:lang w:val="uk-UA"/>
         </w:rPr>
-        <w:t xml:space="preserve">навчитися створювати та запускати проєкти із використанням утиліти </w:t>
-      </w:r>
-      <w:r>
-        <w:rPr>
-          <w:lang w:val="en-US"/>
-        </w:rPr>
-        <w:t xml:space="preserve">Supervisor </w:t>
-      </w:r>
+      </w:pPr>
       <w:r>
         <w:rPr>
           <w:lang w:val="uk-UA"/>
         </w:rPr>
-        <w:t xml:space="preserve">та </w:t>
-      </w:r>
-      <w:r>
-        <w:rPr>
-          <w:lang w:val="en-US"/>
-        </w:rPr>
-        <w:t xml:space="preserve">Nginx </w:t>
-      </w:r>
-      <w:r>
+      </w:r>
+    </w:p>
+    <w:p>
+      <w:pPr>
+        <w:pStyle w:val="h11"/>
+        <w:rPr/>
+      </w:pPr>
+      <w:r>
+        <w:rPr/>
+        <w:t>Завдання</w:t>
+      </w:r>
+    </w:p>
+    <w:p>
+      <w:pPr>
+        <w:pStyle w:val="h11"/>
+        <w:rPr/>
+      </w:pPr>
+      <w:r>
+        <w:rPr/>
+        <w:t>Виконання</w:t>
+      </w:r>
+    </w:p>
+    <w:p>
+      <w:pPr>
+        <w:pStyle w:val="P1"/>
         <w:rPr>
           <w:lang w:val="uk-UA"/>
         </w:rPr>
-        <w:t>сервера.</w:t>
-      </w:r>
-    </w:p>
-    <w:p>
-      <w:pPr>
-        <w:pStyle w:val="P1"/>
+      </w:pPr>
+      <w:r>
         <w:rPr>
           <w:lang w:val="uk-UA"/>
         </w:rPr>
-      </w:pPr>
-      <w:r>
-        <w:rPr>
-          <w:lang w:val="uk-UA"/>
-        </w:rPr>
-      </w:r>
-    </w:p>
-    <w:p>
-      <w:pPr>
-        <w:pStyle w:val="P1"/>
-        <w:rPr>
-          <w:lang w:val="uk-UA"/>
-        </w:rPr>
-      </w:pPr>
-      <w:r>
-        <w:rPr>
-          <w:lang w:val="uk-UA"/>
-        </w:rPr>
+      </w:r>
+    </w:p>
+    <w:p>
+      <w:pPr>
+        <w:pStyle w:val="h11"/>
+        <w:rPr/>
+      </w:pPr>
+      <w:r>
+        <w:rPr/>
         <w:t>Висновки</w:t>
       </w:r>
     </w:p>

</xml_diff>

<commit_message>
feat: redirect to list by default
</commit_message>
<xml_diff>
--- a/51PM Projektuvannja modeluvannja/1/PM_KNT-122_Onyshchenko_19_PR1.docx
+++ b/51PM Projektuvannja modeluvannja/1/PM_KNT-122_Onyshchenko_19_PR1.docx
@@ -159,11 +159,7 @@
       </w:pPr>
       <w:r>
         <w:rPr/>
-        <w:t>Тема «</w:t>
-      </w:r>
-      <w:r>
-        <w:rPr/>
-        <w:t xml:space="preserve">Розроблення веб-застосувань з використанням </w:t>
+        <w:t xml:space="preserve">Тема «Розроблення веб-застосувань з використанням </w:t>
       </w:r>
       <w:r>
         <w:rPr>
@@ -403,11 +399,7 @@
         <w:tab/>
         <w:tab/>
         <w:tab/>
-        <w:t>202</w:t>
-      </w:r>
-      <w:r>
-        <w:rPr/>
-        <w:t>6</w:t>
+        <w:t>2026</w:t>
       </w:r>
     </w:p>
     <w:p>
@@ -436,11 +428,7 @@
       </w:pPr>
       <w:r>
         <w:rPr/>
-        <w:t xml:space="preserve">Ознайомитися </w:t>
-      </w:r>
-      <w:r>
-        <w:rPr/>
-        <w:t xml:space="preserve">із основними можливостям фреймворку </w:t>
+        <w:t xml:space="preserve">Ознайомитися із основними можливостям фреймворку </w:t>
       </w:r>
       <w:r>
         <w:rPr>
@@ -1394,12 +1382,12 @@
       <w:lang w:val="en-US" w:eastAsia="uk-UA"/>
     </w:rPr>
   </w:style>
-  <w:style w:type="character" w:styleId="Style12">
-    <w:name w:val="Символ нумерації"/>
+  <w:style w:type="character" w:styleId="user">
+    <w:name w:val="Символ нумерації (user)"/>
     <w:qFormat/>
     <w:rPr/>
   </w:style>
-  <w:style w:type="paragraph" w:styleId="Style13">
+  <w:style w:type="paragraph" w:styleId="Style12">
     <w:name w:val="Заголовок"/>
     <w:basedOn w:val="Normal"/>
     <w:next w:val="BodyText"/>
@@ -1409,7 +1397,7 @@
       <w:spacing w:before="240" w:after="120"/>
     </w:pPr>
     <w:rPr>
-      <w:rFonts w:ascii="Liberation Sans" w:hAnsi="Liberation Sans" w:eastAsia="Microsoft YaHei" w:cs="Lucida Sans"/>
+      <w:rFonts w:ascii="Liberation Sans" w:hAnsi="Liberation Sans" w:eastAsia="Microsoft YaHei" w:cs="Arial Unicode MS"/>
       <w:sz w:val="28"/>
       <w:szCs w:val="28"/>
     </w:rPr>
@@ -1446,7 +1434,7 @@
       <w:szCs w:val="24"/>
     </w:rPr>
   </w:style>
-  <w:style w:type="paragraph" w:styleId="Style14">
+  <w:style w:type="paragraph" w:styleId="Style13">
     <w:name w:val="Покажчик"/>
     <w:basedOn w:val="Normal"/>
     <w:qFormat/>
@@ -1454,10 +1442,10 @@
       <w:suppressLineNumbers/>
     </w:pPr>
     <w:rPr>
-      <w:rFonts w:cs="Lucida Sans"/>
-    </w:rPr>
-  </w:style>
-  <w:style w:type="paragraph" w:styleId="user">
+      <w:rFonts w:cs="Arial Unicode MS"/>
+    </w:rPr>
+  </w:style>
+  <w:style w:type="paragraph" w:styleId="user1">
     <w:name w:val="Заголовок (user)"/>
     <w:basedOn w:val="Normal"/>
     <w:next w:val="BodyText"/>
@@ -1467,12 +1455,12 @@
       <w:spacing w:before="240" w:after="120"/>
     </w:pPr>
     <w:rPr>
-      <w:rFonts w:ascii="Liberation Sans" w:hAnsi="Liberation Sans" w:eastAsia="Microsoft YaHei" w:cs="Arial Unicode MS"/>
+      <w:rFonts w:ascii="Liberation Sans" w:hAnsi="Liberation Sans" w:eastAsia="Microsoft YaHei" w:cs="Lucida Sans"/>
       <w:sz w:val="28"/>
       <w:szCs w:val="28"/>
     </w:rPr>
   </w:style>
-  <w:style w:type="paragraph" w:styleId="user1">
+  <w:style w:type="paragraph" w:styleId="user2">
     <w:name w:val="Покажчик (user)"/>
     <w:basedOn w:val="Normal"/>
     <w:qFormat/>
@@ -1480,12 +1468,12 @@
       <w:suppressLineNumbers/>
     </w:pPr>
     <w:rPr>
-      <w:rFonts w:cs="Arial Unicode MS"/>
+      <w:rFonts w:cs="Lucida Sans"/>
     </w:rPr>
   </w:style>
   <w:style w:type="paragraph" w:styleId="IndexHeading">
     <w:name w:val="index heading"/>
-    <w:basedOn w:val="user"/>
+    <w:basedOn w:val="Style12"/>
     <w:pPr/>
     <w:rPr/>
   </w:style>
@@ -1758,8 +1746,8 @@
     </w:pPr>
     <w:rPr/>
   </w:style>
-  <w:style w:type="numbering" w:styleId="user2" w:default="1">
-    <w:name w:val="Без маркерів (user)"/>
+  <w:style w:type="numbering" w:styleId="Style14" w:default="1">
+    <w:name w:val="Без маркерів"/>
     <w:uiPriority w:val="99"/>
     <w:semiHidden/>
     <w:unhideWhenUsed/>

</xml_diff>

<commit_message>
feat :add questions to the report
</commit_message>
<xml_diff>
--- a/51PM Projektuvannja modeluvannja/1/PM_KNT-122_Onyshchenko_19_PR1.docx
+++ b/51PM Projektuvannja modeluvannja/1/PM_KNT-122_Onyshchenko_19_PR1.docx
@@ -492,12 +492,117 @@
     </w:p>
     <w:p>
       <w:pPr>
+        <w:pStyle w:val="p11"/>
+        <w:rPr/>
+      </w:pPr>
+      <w:r>
+        <w:rPr/>
+      </w:r>
+    </w:p>
+    <w:p>
+      <w:pPr>
+        <w:pStyle w:val="p11"/>
+        <w:rPr/>
+      </w:pPr>
+      <w:r>
+        <w:rPr/>
+        <w:t>Завдання на роботу наступне:</w:t>
+      </w:r>
+    </w:p>
+    <w:p>
+      <w:pPr>
+        <w:pStyle w:val="p11"/>
+        <w:rPr/>
+      </w:pPr>
+      <w:r>
+        <w:rPr/>
+        <w:t xml:space="preserve">1. Застосувавши  конспект  лекцій  та  додаткову  літературу, вивчити принципи створення проектів у Django. </w:t>
+      </w:r>
+    </w:p>
+    <w:p>
+      <w:pPr>
+        <w:pStyle w:val="p11"/>
+        <w:rPr/>
+      </w:pPr>
+      <w:r>
+        <w:rPr/>
+        <w:t xml:space="preserve">2. Згідно з наведеним прикладом створити веб-застосування за індивідуальним завданням викладача. </w:t>
+      </w:r>
+    </w:p>
+    <w:p>
+      <w:pPr>
+        <w:pStyle w:val="p11"/>
+        <w:rPr/>
+      </w:pPr>
+      <w:r>
+        <w:rPr>
+          <w:i/>
+          <w:iCs/>
+        </w:rPr>
+        <w:t>Варіант 1</w:t>
+      </w:r>
+      <w:r>
+        <w:rPr/>
+        <w:t>. Завдання</w:t>
+      </w:r>
+    </w:p>
+    <w:p>
+      <w:pPr>
+        <w:pStyle w:val="p11"/>
+        <w:rPr/>
+      </w:pPr>
+      <w:r>
+        <w:rPr/>
+        <w:t xml:space="preserve">3. Оформити звіт. Звіт з лабораторної роботи повинен містити: мету  роботи;  завдання  на  виконання  роботи;  тексти  програм; результати роботи; висновки.  </w:t>
+      </w:r>
+    </w:p>
+    <w:p>
+      <w:pPr>
+        <w:pStyle w:val="p11"/>
+        <w:rPr/>
+      </w:pPr>
+      <w:r>
+        <w:rPr/>
+        <w:t>4. Відповісти на контрольні запитання.</w:t>
+      </w:r>
+    </w:p>
+    <w:p>
+      <w:pPr>
+        <w:pStyle w:val="p11"/>
+        <w:rPr/>
+      </w:pPr>
+      <w:r>
+        <w:rPr/>
+      </w:r>
+    </w:p>
+    <w:p>
+      <w:pPr>
         <w:pStyle w:val="h11"/>
         <w:rPr/>
       </w:pPr>
       <w:r>
         <w:rPr/>
-        <w:t>Виконання</w:t>
+        <w:t>Код</w:t>
+      </w:r>
+    </w:p>
+    <w:p>
+      <w:pPr>
+        <w:pStyle w:val="h11"/>
+        <w:rPr/>
+      </w:pPr>
+      <w:r>
+        <w:rPr/>
+        <w:t>Результати</w:t>
+      </w:r>
+    </w:p>
+    <w:p>
+      <w:pPr>
+        <w:pStyle w:val="h11"/>
+        <w:rPr/>
+      </w:pPr>
+      <w:r>
+        <w:rPr/>
+        <w:t>Висновки</w:t>
       </w:r>
     </w:p>
     <w:p>
@@ -515,73 +620,103 @@
     </w:p>
     <w:p>
       <w:pPr>
+        <w:pStyle w:val="P1"/>
+        <w:rPr/>
+      </w:pPr>
+      <w:r>
+        <w:rPr>
+          <w:lang w:val="uk-UA"/>
+        </w:rPr>
+        <w:t xml:space="preserve">Отож, при виконанні лабораторної роботи було ознайомлено із основними можливостям фреймворку </w:t>
+      </w:r>
+      <w:r>
+        <w:rPr>
+          <w:lang w:val="en-US"/>
+        </w:rPr>
+        <w:t xml:space="preserve">Django, </w:t>
+      </w:r>
+      <w:r>
+        <w:rPr>
+          <w:lang w:val="uk-UA"/>
+        </w:rPr>
+        <w:t xml:space="preserve">навчено студента створювати та запускати проєкти із використанням утиліти </w:t>
+      </w:r>
+      <w:r>
+        <w:rPr>
+          <w:lang w:val="en-US"/>
+        </w:rPr>
+        <w:t xml:space="preserve">Supervisor </w:t>
+      </w:r>
+      <w:r>
+        <w:rPr>
+          <w:lang w:val="uk-UA"/>
+        </w:rPr>
+        <w:t xml:space="preserve">та </w:t>
+      </w:r>
+      <w:r>
+        <w:rPr>
+          <w:lang w:val="en-US"/>
+        </w:rPr>
+        <w:t xml:space="preserve">Nginx </w:t>
+      </w:r>
+      <w:r>
+        <w:rPr>
+          <w:lang w:val="uk-UA"/>
+        </w:rPr>
+        <w:t>сервера.</w:t>
+      </w:r>
+    </w:p>
+    <w:p>
+      <w:pPr>
+        <w:pStyle w:val="P1"/>
+        <w:rPr>
+          <w:lang w:val="uk-UA"/>
+        </w:rPr>
+      </w:pPr>
+      <w:r>
+        <w:rPr>
+          <w:lang w:val="uk-UA"/>
+        </w:rPr>
+      </w:r>
+    </w:p>
+    <w:p>
+      <w:pPr>
         <w:pStyle w:val="h11"/>
         <w:rPr/>
       </w:pPr>
       <w:r>
         <w:rPr/>
-        <w:t>Висновки</w:t>
-      </w:r>
-    </w:p>
-    <w:p>
-      <w:pPr>
-        <w:pStyle w:val="P1"/>
-        <w:rPr>
-          <w:lang w:val="uk-UA"/>
-        </w:rPr>
-      </w:pPr>
-      <w:r>
-        <w:rPr>
-          <w:lang w:val="uk-UA"/>
-        </w:rPr>
-      </w:r>
-    </w:p>
-    <w:p>
-      <w:pPr>
-        <w:pStyle w:val="P1"/>
-        <w:rPr/>
-      </w:pPr>
-      <w:r>
-        <w:rPr>
-          <w:lang w:val="uk-UA"/>
-        </w:rPr>
-        <w:t xml:space="preserve">Отож, при виконанні лабораторної роботи було ознайомлено із основними можливостям фреймворку </w:t>
-      </w:r>
-      <w:r>
-        <w:rPr>
-          <w:lang w:val="en-US"/>
-        </w:rPr>
-        <w:t xml:space="preserve">Django, </w:t>
-      </w:r>
-      <w:r>
-        <w:rPr>
-          <w:lang w:val="uk-UA"/>
-        </w:rPr>
-        <w:t xml:space="preserve">навчено студента створювати та запускати проєкти із використанням утиліти </w:t>
-      </w:r>
-      <w:r>
-        <w:rPr>
-          <w:lang w:val="en-US"/>
-        </w:rPr>
-        <w:t xml:space="preserve">Supervisor </w:t>
-      </w:r>
-      <w:r>
-        <w:rPr>
-          <w:lang w:val="uk-UA"/>
-        </w:rPr>
-        <w:t xml:space="preserve">та </w:t>
-      </w:r>
-      <w:r>
-        <w:rPr>
-          <w:lang w:val="en-US"/>
-        </w:rPr>
-        <w:t xml:space="preserve">Nginx </w:t>
-      </w:r>
-      <w:r>
-        <w:rPr>
-          <w:lang w:val="uk-UA"/>
-        </w:rPr>
-        <w:t>сервера.</w:t>
+        <w:t>Питання</w:t>
+      </w:r>
+    </w:p>
+    <w:p>
+      <w:pPr>
+        <w:pStyle w:val="H2"/>
+        <w:rPr/>
+      </w:pPr>
+      <w:r>
+        <w:rPr/>
+        <w:t xml:space="preserve">Перелічіть можливості Django. </w:t>
+      </w:r>
+    </w:p>
+    <w:p>
+      <w:pPr>
+        <w:pStyle w:val="H2"/>
+        <w:rPr/>
+      </w:pPr>
+      <w:r>
+        <w:rPr/>
+        <w:t xml:space="preserve">Які головні принципи реалізовує Django? </w:t>
+      </w:r>
+    </w:p>
+    <w:p>
+      <w:pPr>
+        <w:pStyle w:val="H2"/>
+        <w:rPr/>
+      </w:pPr>
+      <w:r>
+        <w:rPr/>
+        <w:t>Для чого використовується віртуальне середовище? Як його створити?</w:t>
       </w:r>
     </w:p>
     <w:sectPr>

</xml_diff>

<commit_message>
feat: fill in the questions in the report
</commit_message>
<xml_diff>
--- a/51PM Projektuvannja modeluvannja/1/PM_KNT-122_Onyshchenko_19_PR1.docx
+++ b/51PM Projektuvannja modeluvannja/1/PM_KNT-122_Onyshchenko_19_PR1.docx
@@ -516,7 +516,15 @@
       </w:pPr>
       <w:r>
         <w:rPr/>
-        <w:t xml:space="preserve">1. Застосувавши  конспект  лекцій  та  додаткову  літературу, вивчити принципи створення проектів у Django. </w:t>
+        <w:t>1. Застосувавши  конспект  лекцій  та  додаткову  літературу, вивчити принципи створення про</w:t>
+      </w:r>
+      <w:r>
+        <w:rPr/>
+        <w:t>є</w:t>
+      </w:r>
+      <w:r>
+        <w:rPr/>
+        <w:t xml:space="preserve">ктів у Django. </w:t>
       </w:r>
     </w:p>
     <w:p>
@@ -701,6 +709,162 @@
     </w:p>
     <w:p>
       <w:pPr>
+        <w:pStyle w:val="P1"/>
+        <w:rPr/>
+      </w:pPr>
+      <w:r>
+        <w:rPr/>
+      </w:r>
+    </w:p>
+    <w:p>
+      <w:pPr>
+        <w:pStyle w:val="P1"/>
+        <w:rPr/>
+      </w:pPr>
+      <w:r>
+        <w:rPr/>
+        <w:t xml:space="preserve">Основні можливості </w:t>
+      </w:r>
+      <w:r>
+        <w:rPr>
+          <w:lang w:val="en-US"/>
+        </w:rPr>
+        <w:t xml:space="preserve">Django </w:t>
+      </w:r>
+      <w:r>
+        <w:rPr>
+          <w:lang w:val="uk-UA"/>
+        </w:rPr>
+        <w:t>такі:</w:t>
+      </w:r>
+    </w:p>
+    <w:p>
+      <w:pPr>
+        <w:pStyle w:val="P1"/>
+        <w:rPr>
+          <w:lang w:val="uk-UA"/>
+        </w:rPr>
+      </w:pPr>
+      <w:r>
+        <w:rPr>
+          <w:lang w:val="uk-UA"/>
+        </w:rPr>
+        <w:t xml:space="preserve">1. Створення шаблонів </w:t>
+      </w:r>
+      <w:r>
+        <w:rPr>
+          <w:lang w:val="en-US"/>
+        </w:rPr>
+        <w:t xml:space="preserve">(templates) </w:t>
+      </w:r>
+      <w:r>
+        <w:rPr>
+          <w:lang w:val="uk-UA"/>
+        </w:rPr>
+        <w:t>веб-застосунків;</w:t>
+      </w:r>
+    </w:p>
+    <w:p>
+      <w:pPr>
+        <w:pStyle w:val="P1"/>
+        <w:rPr>
+          <w:lang w:val="uk-UA"/>
+        </w:rPr>
+      </w:pPr>
+      <w:r>
+        <w:rPr>
+          <w:lang w:val="uk-UA"/>
+        </w:rPr>
+        <w:t xml:space="preserve">2. Створення представлень </w:t>
+      </w:r>
+      <w:r>
+        <w:rPr>
+          <w:lang w:val="en-US"/>
+        </w:rPr>
+        <w:t xml:space="preserve">(views) </w:t>
+      </w:r>
+      <w:r>
+        <w:rPr>
+          <w:lang w:val="uk-UA"/>
+        </w:rPr>
+        <w:t>веб-застосунків;</w:t>
+      </w:r>
+    </w:p>
+    <w:p>
+      <w:pPr>
+        <w:pStyle w:val="P1"/>
+        <w:rPr>
+          <w:lang w:val="uk-UA"/>
+        </w:rPr>
+      </w:pPr>
+      <w:r>
+        <w:rPr>
+          <w:lang w:val="uk-UA"/>
+        </w:rPr>
+        <w:t>3. Створення моделей</w:t>
+      </w:r>
+      <w:r>
+        <w:rPr>
+          <w:lang w:val="en-US"/>
+        </w:rPr>
+        <w:t xml:space="preserve"> (models) </w:t>
+      </w:r>
+      <w:r>
+        <w:rPr>
+          <w:lang w:val="uk-UA"/>
+        </w:rPr>
+        <w:t>веб-застосунків.</w:t>
+      </w:r>
+    </w:p>
+    <w:p>
+      <w:pPr>
+        <w:pStyle w:val="P1"/>
+        <w:rPr>
+          <w:lang w:val="en-US"/>
+        </w:rPr>
+      </w:pPr>
+      <w:r>
+        <w:rPr>
+          <w:lang w:val="en-US"/>
+        </w:rPr>
+        <w:t xml:space="preserve">4. </w:t>
+      </w:r>
+      <w:r>
+        <w:rPr>
+          <w:lang w:val="uk-UA"/>
+        </w:rPr>
+        <w:t>Взаємодія з базою даних.</w:t>
+      </w:r>
+    </w:p>
+    <w:p>
+      <w:pPr>
+        <w:pStyle w:val="P1"/>
+        <w:rPr>
+          <w:lang w:val="uk-UA"/>
+        </w:rPr>
+      </w:pPr>
+      <w:r>
+        <w:rPr>
+          <w:lang w:val="uk-UA"/>
+        </w:rPr>
+        <w:t>5. Можливість авторизувати користувача.</w:t>
+      </w:r>
+    </w:p>
+    <w:p>
+      <w:pPr>
+        <w:pStyle w:val="P1"/>
+        <w:rPr>
+          <w:lang w:val="uk-UA"/>
+        </w:rPr>
+      </w:pPr>
+      <w:r>
+        <w:rPr>
+          <w:lang w:val="uk-UA"/>
+        </w:rPr>
+      </w:r>
+    </w:p>
+    <w:p>
+      <w:pPr>
         <w:pStyle w:val="H2"/>
         <w:rPr/>
       </w:pPr>
@@ -711,12 +875,261 @@
     </w:p>
     <w:p>
       <w:pPr>
+        <w:pStyle w:val="P1"/>
+        <w:rPr/>
+      </w:pPr>
+      <w:r>
+        <w:rPr/>
+      </w:r>
+    </w:p>
+    <w:p>
+      <w:pPr>
+        <w:pStyle w:val="P1"/>
+        <w:rPr/>
+      </w:pPr>
+      <w:r>
+        <w:rPr/>
+        <w:t xml:space="preserve">Головні принципи, які реалізовує </w:t>
+      </w:r>
+      <w:r>
+        <w:rPr>
+          <w:lang w:val="en-US"/>
+        </w:rPr>
+        <w:t xml:space="preserve">Django </w:t>
+      </w:r>
+      <w:r>
+        <w:rPr>
+          <w:lang w:val="uk-UA"/>
+        </w:rPr>
+        <w:t>це:</w:t>
+      </w:r>
+    </w:p>
+    <w:p>
+      <w:pPr>
+        <w:pStyle w:val="P1"/>
+        <w:rPr>
+          <w:lang w:val="uk-UA"/>
+        </w:rPr>
+      </w:pPr>
+      <w:r>
+        <w:rPr>
+          <w:lang w:val="uk-UA"/>
+        </w:rPr>
+        <w:t>- Об’єктно-орієнтоване програмування.</w:t>
+      </w:r>
+    </w:p>
+    <w:p>
+      <w:pPr>
+        <w:pStyle w:val="P1"/>
+        <w:rPr>
+          <w:lang w:val="uk-UA"/>
+        </w:rPr>
+      </w:pPr>
+      <w:r>
+        <w:rPr>
+          <w:lang w:val="uk-UA"/>
+        </w:rPr>
+        <w:t xml:space="preserve">- Модель </w:t>
+      </w:r>
+      <w:r>
+        <w:rPr>
+          <w:lang w:val="en-US"/>
+        </w:rPr>
+        <w:t>MVT (Model View Template).</w:t>
+      </w:r>
+    </w:p>
+    <w:p>
+      <w:pPr>
+        <w:pStyle w:val="P1"/>
+        <w:rPr>
+          <w:lang w:val="en-US"/>
+        </w:rPr>
+      </w:pPr>
+      <w:r>
+        <w:rPr>
+          <w:lang w:val="en-US"/>
+        </w:rPr>
+        <w:t>- DRY (Don’t Repeat Yourself).</w:t>
+      </w:r>
+    </w:p>
+    <w:p>
+      <w:pPr>
+        <w:pStyle w:val="P1"/>
+        <w:rPr>
+          <w:lang w:val="en-US"/>
+        </w:rPr>
+      </w:pPr>
+      <w:r>
+        <w:rPr>
+          <w:lang w:val="en-US"/>
+        </w:rPr>
+      </w:r>
+    </w:p>
+    <w:p>
+      <w:pPr>
         <w:pStyle w:val="H2"/>
         <w:rPr/>
       </w:pPr>
       <w:r>
         <w:rPr/>
         <w:t>Для чого використовується віртуальне середовище? Як його створити?</w:t>
+      </w:r>
+    </w:p>
+    <w:p>
+      <w:pPr>
+        <w:pStyle w:val="P1"/>
+        <w:rPr/>
+      </w:pPr>
+      <w:r>
+        <w:rPr/>
+      </w:r>
+    </w:p>
+    <w:p>
+      <w:pPr>
+        <w:pStyle w:val="P1"/>
+        <w:rPr/>
+      </w:pPr>
+      <w:r>
+        <w:rPr/>
+        <w:t xml:space="preserve">Віртуальне середовище використовується для створення окремої версії мови </w:t>
+      </w:r>
+      <w:r>
+        <w:rPr>
+          <w:lang w:val="en-US"/>
+        </w:rPr>
+        <w:t xml:space="preserve">Python </w:t>
+      </w:r>
+      <w:r>
+        <w:rPr>
+          <w:lang w:val="uk-UA"/>
+        </w:rPr>
+        <w:t>з відповідними версіями пакетів.</w:t>
+      </w:r>
+    </w:p>
+    <w:p>
+      <w:pPr>
+        <w:pStyle w:val="P1"/>
+        <w:rPr>
+          <w:lang w:val="uk-UA"/>
+        </w:rPr>
+      </w:pPr>
+      <w:r>
+        <w:rPr>
+          <w:lang w:val="uk-UA"/>
+        </w:rPr>
+        <w:t xml:space="preserve">Створити віртуальне середовище можна використовуючи утиліту </w:t>
+      </w:r>
+      <w:r>
+        <w:rPr>
+          <w:lang w:val="en-US"/>
+        </w:rPr>
+        <w:t>uv:</w:t>
+      </w:r>
+    </w:p>
+    <w:p>
+      <w:pPr>
+        <w:pStyle w:val="user1"/>
+        <w:rPr/>
+      </w:pPr>
+      <w:r>
+        <w:rPr/>
+        <w:t xml:space="preserve">1. </w:t>
+      </w:r>
+      <w:r>
+        <w:rPr>
+          <w:lang w:val="uk-UA"/>
+        </w:rPr>
+        <w:t xml:space="preserve">Спочатку запустити команду </w:t>
+      </w:r>
+      <w:r>
+        <w:rPr/>
+        <w:t xml:space="preserve">`uv init </w:t>
+      </w:r>
+      <w:r>
+        <w:rPr>
+          <w:lang w:val="uk-UA"/>
+        </w:rPr>
+        <w:t>назваПроєкту</w:t>
+      </w:r>
+      <w:r>
+        <w:rPr/>
+        <w:t>`.</w:t>
+      </w:r>
+    </w:p>
+    <w:p>
+      <w:pPr>
+        <w:pStyle w:val="user1"/>
+        <w:rPr>
+          <w:lang w:val="en-US"/>
+        </w:rPr>
+      </w:pPr>
+      <w:r>
+        <w:rPr>
+          <w:lang w:val="en-US"/>
+        </w:rPr>
+        <w:t xml:space="preserve">2. </w:t>
+      </w:r>
+      <w:r>
+        <w:rPr>
+          <w:lang w:val="uk-UA"/>
+        </w:rPr>
+        <w:t xml:space="preserve">Далі перейти у цей проєкт командою </w:t>
+      </w:r>
+      <w:r>
+        <w:rPr>
+          <w:lang w:val="en-US"/>
+        </w:rPr>
+        <w:t xml:space="preserve">`cd </w:t>
+      </w:r>
+      <w:r>
+        <w:rPr>
+          <w:lang w:val="uk-UA"/>
+        </w:rPr>
+        <w:t>назваПроєкту</w:t>
+      </w:r>
+      <w:r>
+        <w:rPr>
+          <w:lang w:val="en-US"/>
+        </w:rPr>
+        <w:t>`</w:t>
+      </w:r>
+      <w:r>
+        <w:rPr>
+          <w:lang w:val="uk-UA"/>
+        </w:rPr>
+        <w:t>.</w:t>
+      </w:r>
+    </w:p>
+    <w:p>
+      <w:pPr>
+        <w:pStyle w:val="user1"/>
+        <w:rPr>
+          <w:lang w:val="uk-UA"/>
+        </w:rPr>
+      </w:pPr>
+      <w:r>
+        <w:rPr>
+          <w:lang w:val="uk-UA"/>
+        </w:rPr>
+        <w:t xml:space="preserve">3. Після цього можна додати пакети командою </w:t>
+      </w:r>
+      <w:r>
+        <w:rPr>
+          <w:lang w:val="en-US"/>
+        </w:rPr>
+        <w:t xml:space="preserve">`uv add </w:t>
+      </w:r>
+      <w:r>
+        <w:rPr>
+          <w:lang w:val="uk-UA"/>
+        </w:rPr>
+        <w:t>назваПакету</w:t>
+      </w:r>
+      <w:r>
+        <w:rPr>
+          <w:lang w:val="en-US"/>
+        </w:rPr>
+        <w:t>`.</w:t>
       </w:r>
     </w:p>
     <w:sectPr>
@@ -1517,12 +1930,12 @@
       <w:lang w:val="en-US" w:eastAsia="uk-UA"/>
     </w:rPr>
   </w:style>
-  <w:style w:type="character" w:styleId="user">
-    <w:name w:val="Символ нумерації (user)"/>
+  <w:style w:type="character" w:styleId="Style12">
+    <w:name w:val="Символ нумерації"/>
     <w:qFormat/>
     <w:rPr/>
   </w:style>
-  <w:style w:type="paragraph" w:styleId="Style12">
+  <w:style w:type="paragraph" w:styleId="Style13">
     <w:name w:val="Заголовок"/>
     <w:basedOn w:val="Normal"/>
     <w:next w:val="BodyText"/>
@@ -1532,7 +1945,7 @@
       <w:spacing w:before="240" w:after="120"/>
     </w:pPr>
     <w:rPr>
-      <w:rFonts w:ascii="Liberation Sans" w:hAnsi="Liberation Sans" w:eastAsia="Microsoft YaHei" w:cs="Arial Unicode MS"/>
+      <w:rFonts w:ascii="Liberation Sans" w:hAnsi="Liberation Sans" w:eastAsia="Microsoft YaHei" w:cs="Lucida Sans"/>
       <w:sz w:val="28"/>
       <w:szCs w:val="28"/>
     </w:rPr>
@@ -1569,7 +1982,7 @@
       <w:szCs w:val="24"/>
     </w:rPr>
   </w:style>
-  <w:style w:type="paragraph" w:styleId="Style13">
+  <w:style w:type="paragraph" w:styleId="Style14">
     <w:name w:val="Покажчик"/>
     <w:basedOn w:val="Normal"/>
     <w:qFormat/>
@@ -1577,10 +1990,10 @@
       <w:suppressLineNumbers/>
     </w:pPr>
     <w:rPr>
-      <w:rFonts w:cs="Arial Unicode MS"/>
-    </w:rPr>
-  </w:style>
-  <w:style w:type="paragraph" w:styleId="user1">
+      <w:rFonts w:cs="Lucida Sans"/>
+    </w:rPr>
+  </w:style>
+  <w:style w:type="paragraph" w:styleId="user">
     <w:name w:val="Заголовок (user)"/>
     <w:basedOn w:val="Normal"/>
     <w:next w:val="BodyText"/>
@@ -1590,12 +2003,12 @@
       <w:spacing w:before="240" w:after="120"/>
     </w:pPr>
     <w:rPr>
-      <w:rFonts w:ascii="Liberation Sans" w:hAnsi="Liberation Sans" w:eastAsia="Microsoft YaHei" w:cs="Lucida Sans"/>
+      <w:rFonts w:ascii="Liberation Sans" w:hAnsi="Liberation Sans" w:eastAsia="Microsoft YaHei" w:cs="Arial Unicode MS"/>
       <w:sz w:val="28"/>
       <w:szCs w:val="28"/>
     </w:rPr>
   </w:style>
-  <w:style w:type="paragraph" w:styleId="user2">
+  <w:style w:type="paragraph" w:styleId="user1">
     <w:name w:val="Покажчик (user)"/>
     <w:basedOn w:val="Normal"/>
     <w:qFormat/>
@@ -1603,12 +2016,12 @@
       <w:suppressLineNumbers/>
     </w:pPr>
     <w:rPr>
-      <w:rFonts w:cs="Lucida Sans"/>
+      <w:rFonts w:cs="Arial Unicode MS"/>
     </w:rPr>
   </w:style>
   <w:style w:type="paragraph" w:styleId="IndexHeading">
     <w:name w:val="index heading"/>
-    <w:basedOn w:val="Style12"/>
+    <w:basedOn w:val="user"/>
     <w:pPr/>
     <w:rPr/>
   </w:style>
@@ -1881,8 +2294,8 @@
     </w:pPr>
     <w:rPr/>
   </w:style>
-  <w:style w:type="numbering" w:styleId="Style14" w:default="1">
-    <w:name w:val="Без маркерів"/>
+  <w:style w:type="numbering" w:styleId="user2" w:default="1">
+    <w:name w:val="Без маркерів (user)"/>
     <w:uiPriority w:val="99"/>
     <w:semiHidden/>
     <w:unhideWhenUsed/>

</xml_diff>

<commit_message>
feat: add the doctor model
</commit_message>
<xml_diff>
--- a/51PM Projektuvannja modeluvannja/1/PM_KNT-122_Onyshchenko_19_PR1.docx
+++ b/51PM Projektuvannja modeluvannja/1/PM_KNT-122_Onyshchenko_19_PR1.docx
@@ -256,7 +256,15 @@
           <w:b/>
           <w:bCs/>
         </w:rPr>
-        <w:t>Виконав варіант 19</w:t>
+        <w:t xml:space="preserve">Виконав варіант </w:t>
+      </w:r>
+      <w:r>
+        <w:rPr>
+          <w:b/>
+          <w:bCs/>
+          <w:lang w:val="en-US"/>
+        </w:rPr>
+        <w:t>19</w:t>
       </w:r>
     </w:p>
     <w:p>
@@ -551,7 +559,7 @@
       </w:r>
       <w:r>
         <w:rPr/>
-        <w:t>. Завдання</w:t>
+        <w:t>. Створити базу даних лікарів та форми додавання та звільнення персоналу.</w:t>
       </w:r>
     </w:p>
     <w:p>

</xml_diff>

<commit_message>
feat: fininsh the first lab on modeling
</commit_message>
<xml_diff>
--- a/51PM Projektuvannja modeluvannja/1/PM_KNT-122_Onyshchenko_19_PR1.docx
+++ b/51PM Projektuvannja modeluvannja/1/PM_KNT-122_Onyshchenko_19_PR1.docx
@@ -5,10 +5,17 @@
     <w:p>
       <w:pPr>
         <w:pStyle w:val="P1"/>
-        <w:rPr/>
-      </w:pPr>
-      <w:r>
-        <w:rPr/>
+        <w:jc w:val="center"/>
+        <w:rPr>
+          <w:b/>
+          <w:bCs/>
+        </w:rPr>
+      </w:pPr>
+      <w:r>
+        <w:rPr>
+          <w:b/>
+          <w:bCs/>
+        </w:rPr>
         <w:t>Міністерство освіти і науки України</w:t>
       </w:r>
     </w:p>
@@ -603,12 +610,1927 @@
     </w:p>
     <w:p>
       <w:pPr>
+        <w:pStyle w:val="H2"/>
+        <w:rPr/>
+      </w:pPr>
+      <w:r>
+        <w:rPr/>
+        <w:t>models.py</w:t>
+      </w:r>
+    </w:p>
+    <w:p>
+      <w:pPr>
+        <w:pStyle w:val="p11"/>
+        <w:rPr>
+          <w:lang w:val="en-US"/>
+        </w:rPr>
+      </w:pPr>
+      <w:r>
+        <w:rPr>
+          <w:lang w:val="en-US"/>
+        </w:rPr>
+      </w:r>
+    </w:p>
+    <w:p>
+      <w:pPr>
+        <w:pStyle w:val="Code"/>
+        <w:rPr/>
+      </w:pPr>
+      <w:r>
+        <w:rPr/>
+        <w:t>def validate_full_name(value: str):</w:t>
+      </w:r>
+    </w:p>
+    <w:p>
+      <w:pPr>
+        <w:pStyle w:val="Code"/>
+        <w:rPr/>
+      </w:pPr>
+      <w:r>
+        <w:rPr/>
+        <w:t xml:space="preserve">    </w:t>
+      </w:r>
+      <w:r>
+        <w:rPr/>
+        <w:t>if not " " in value:</w:t>
+      </w:r>
+    </w:p>
+    <w:p>
+      <w:pPr>
+        <w:pStyle w:val="Code"/>
+        <w:rPr/>
+      </w:pPr>
+      <w:r>
+        <w:rPr/>
+        <w:t xml:space="preserve">        </w:t>
+      </w:r>
+      <w:r>
+        <w:rPr/>
+        <w:t>raise ValidationError(</w:t>
+      </w:r>
+    </w:p>
+    <w:p>
+      <w:pPr>
+        <w:pStyle w:val="Code"/>
+        <w:rPr/>
+      </w:pPr>
+      <w:r>
+        <w:rPr/>
+        <w:t xml:space="preserve">            </w:t>
+      </w:r>
+      <w:r>
+        <w:rPr/>
+        <w:t>"Full name does not contain a space.", params={"value": value}</w:t>
+      </w:r>
+    </w:p>
+    <w:p>
+      <w:pPr>
+        <w:pStyle w:val="Code"/>
+        <w:rPr/>
+      </w:pPr>
+      <w:r>
+        <w:rPr/>
+        <w:t xml:space="preserve">        </w:t>
+      </w:r>
+      <w:r>
+        <w:rPr/>
+        <w:t>)</w:t>
+      </w:r>
+    </w:p>
+    <w:p>
+      <w:pPr>
+        <w:pStyle w:val="Code"/>
+        <w:rPr/>
+      </w:pPr>
+      <w:r>
+        <w:rPr/>
+      </w:r>
+    </w:p>
+    <w:p>
+      <w:pPr>
+        <w:pStyle w:val="Code"/>
+        <w:rPr/>
+      </w:pPr>
+      <w:r>
+        <w:rPr/>
+      </w:r>
+    </w:p>
+    <w:p>
+      <w:pPr>
+        <w:pStyle w:val="Code"/>
+        <w:rPr/>
+      </w:pPr>
+      <w:r>
+        <w:rPr/>
+        <w:t>class Doctor(models.Model):</w:t>
+      </w:r>
+    </w:p>
+    <w:p>
+      <w:pPr>
+        <w:pStyle w:val="Code"/>
+        <w:rPr/>
+      </w:pPr>
+      <w:r>
+        <w:rPr/>
+        <w:t xml:space="preserve">    </w:t>
+      </w:r>
+      <w:r>
+        <w:rPr/>
+        <w:t>full_name = models.CharField(max_length=250, validators=[validate_full_name])</w:t>
+      </w:r>
+    </w:p>
+    <w:p>
+      <w:pPr>
+        <w:pStyle w:val="Code"/>
+        <w:rPr/>
+      </w:pPr>
+      <w:r>
+        <w:rPr/>
+      </w:r>
+    </w:p>
+    <w:p>
+      <w:pPr>
+        <w:pStyle w:val="Code"/>
+        <w:rPr/>
+      </w:pPr>
+      <w:r>
+        <w:rPr/>
+        <w:t xml:space="preserve">    </w:t>
+      </w:r>
+      <w:r>
+        <w:rPr/>
+        <w:t>def __str__(self) -&gt; str:</w:t>
+      </w:r>
+    </w:p>
+    <w:p>
+      <w:pPr>
+        <w:pStyle w:val="Code"/>
+        <w:rPr/>
+      </w:pPr>
+      <w:r>
+        <w:rPr/>
+        <w:t xml:space="preserve">        </w:t>
+      </w:r>
+      <w:r>
+        <w:rPr/>
+        <w:t>return self.full_name.title()</w:t>
+      </w:r>
+    </w:p>
+    <w:p>
+      <w:pPr>
+        <w:pStyle w:val="p11"/>
+        <w:rPr>
+          <w:lang w:val="en-US"/>
+        </w:rPr>
+      </w:pPr>
+      <w:r>
+        <w:rPr>
+          <w:lang w:val="en-US"/>
+        </w:rPr>
+      </w:r>
+    </w:p>
+    <w:p>
+      <w:pPr>
+        <w:pStyle w:val="H2"/>
+        <w:rPr/>
+      </w:pPr>
+      <w:r>
+        <w:rPr>
+          <w:lang w:val="en-US"/>
+        </w:rPr>
+        <w:t>urls</w:t>
+      </w:r>
+      <w:r>
+        <w:rPr/>
+        <w:t>.py</w:t>
+      </w:r>
+    </w:p>
+    <w:p>
+      <w:pPr>
+        <w:pStyle w:val="p11"/>
+        <w:rPr>
+          <w:lang w:val="en-US"/>
+        </w:rPr>
+      </w:pPr>
+      <w:r>
+        <w:rPr>
+          <w:lang w:val="en-US"/>
+        </w:rPr>
+      </w:r>
+    </w:p>
+    <w:p>
+      <w:pPr>
+        <w:pStyle w:val="Code"/>
+        <w:rPr/>
+      </w:pPr>
+      <w:r>
+        <w:rPr/>
+        <w:t>urlpatterns = [</w:t>
+      </w:r>
+    </w:p>
+    <w:p>
+      <w:pPr>
+        <w:pStyle w:val="Code"/>
+        <w:rPr/>
+      </w:pPr>
+      <w:r>
+        <w:rPr/>
+        <w:t xml:space="preserve">    </w:t>
+      </w:r>
+      <w:r>
+        <w:rPr/>
+        <w:t>path("", views.index_view, name="index"),</w:t>
+      </w:r>
+    </w:p>
+    <w:p>
+      <w:pPr>
+        <w:pStyle w:val="Code"/>
+        <w:rPr/>
+      </w:pPr>
+      <w:r>
+        <w:rPr/>
+        <w:t xml:space="preserve">    </w:t>
+      </w:r>
+      <w:r>
+        <w:rPr/>
+        <w:t>path("create", views.DoctorCreate.as_view(), name="create"),</w:t>
+      </w:r>
+    </w:p>
+    <w:p>
+      <w:pPr>
+        <w:pStyle w:val="Code"/>
+        <w:rPr/>
+      </w:pPr>
+      <w:r>
+        <w:rPr/>
+        <w:t xml:space="preserve">    </w:t>
+      </w:r>
+      <w:r>
+        <w:rPr/>
+        <w:t>path("list", views.DoctorList.as_view(), name="list"),</w:t>
+      </w:r>
+    </w:p>
+    <w:p>
+      <w:pPr>
+        <w:pStyle w:val="Code"/>
+        <w:rPr/>
+      </w:pPr>
+      <w:r>
+        <w:rPr/>
+        <w:t xml:space="preserve">    </w:t>
+      </w:r>
+      <w:r>
+        <w:rPr/>
+        <w:t>path("&lt;pk&gt;/delete/", views.DoctorDelete.as_view(), name="delete"),</w:t>
+      </w:r>
+    </w:p>
+    <w:p>
+      <w:pPr>
+        <w:pStyle w:val="Code"/>
+        <w:rPr/>
+      </w:pPr>
+      <w:r>
+        <w:rPr/>
+        <w:t>]</w:t>
+      </w:r>
+    </w:p>
+    <w:p>
+      <w:pPr>
+        <w:pStyle w:val="p11"/>
+        <w:rPr>
+          <w:lang w:val="en-US"/>
+        </w:rPr>
+      </w:pPr>
+      <w:r>
+        <w:rPr>
+          <w:lang w:val="en-US"/>
+        </w:rPr>
+      </w:r>
+    </w:p>
+    <w:p>
+      <w:pPr>
+        <w:pStyle w:val="H2"/>
+        <w:rPr/>
+      </w:pPr>
+      <w:r>
+        <w:rPr/>
+        <w:t>views.py</w:t>
+      </w:r>
+    </w:p>
+    <w:p>
+      <w:pPr>
+        <w:pStyle w:val="p11"/>
+        <w:rPr>
+          <w:lang w:val="en-US"/>
+        </w:rPr>
+      </w:pPr>
+      <w:r>
+        <w:rPr>
+          <w:lang w:val="en-US"/>
+        </w:rPr>
+      </w:r>
+    </w:p>
+    <w:p>
+      <w:pPr>
+        <w:pStyle w:val="Code"/>
+        <w:rPr/>
+      </w:pPr>
+      <w:r>
+        <w:rPr/>
+        <w:t>def index_view(req: HttpRequest):</w:t>
+      </w:r>
+    </w:p>
+    <w:p>
+      <w:pPr>
+        <w:pStyle w:val="Code"/>
+        <w:rPr/>
+      </w:pPr>
+      <w:r>
+        <w:rPr/>
+        <w:t xml:space="preserve">    </w:t>
+      </w:r>
+      <w:r>
+        <w:rPr/>
+        <w:t>return redirect("list")</w:t>
+      </w:r>
+    </w:p>
+    <w:p>
+      <w:pPr>
+        <w:pStyle w:val="Code"/>
+        <w:rPr/>
+      </w:pPr>
+      <w:r>
+        <w:rPr/>
+      </w:r>
+    </w:p>
+    <w:p>
+      <w:pPr>
+        <w:pStyle w:val="Code"/>
+        <w:rPr/>
+      </w:pPr>
+      <w:r>
+        <w:rPr/>
+      </w:r>
+    </w:p>
+    <w:p>
+      <w:pPr>
+        <w:pStyle w:val="Code"/>
+        <w:rPr/>
+      </w:pPr>
+      <w:r>
+        <w:rPr/>
+        <w:t>class DoctorCreate(generic.CreateView):</w:t>
+      </w:r>
+    </w:p>
+    <w:p>
+      <w:pPr>
+        <w:pStyle w:val="Code"/>
+        <w:rPr/>
+      </w:pPr>
+      <w:r>
+        <w:rPr/>
+        <w:t xml:space="preserve">    </w:t>
+      </w:r>
+      <w:r>
+        <w:rPr/>
+        <w:t>model = Doctor</w:t>
+      </w:r>
+    </w:p>
+    <w:p>
+      <w:pPr>
+        <w:pStyle w:val="Code"/>
+        <w:rPr/>
+      </w:pPr>
+      <w:r>
+        <w:rPr/>
+        <w:t xml:space="preserve">    </w:t>
+      </w:r>
+      <w:r>
+        <w:rPr/>
+        <w:t>fields = "__all__"</w:t>
+      </w:r>
+    </w:p>
+    <w:p>
+      <w:pPr>
+        <w:pStyle w:val="Code"/>
+        <w:rPr/>
+      </w:pPr>
+      <w:r>
+        <w:rPr/>
+        <w:t xml:space="preserve">    </w:t>
+      </w:r>
+      <w:r>
+        <w:rPr/>
+        <w:t>success_url = "/list"</w:t>
+      </w:r>
+    </w:p>
+    <w:p>
+      <w:pPr>
+        <w:pStyle w:val="Code"/>
+        <w:rPr/>
+      </w:pPr>
+      <w:r>
+        <w:rPr/>
+      </w:r>
+    </w:p>
+    <w:p>
+      <w:pPr>
+        <w:pStyle w:val="Code"/>
+        <w:rPr/>
+      </w:pPr>
+      <w:r>
+        <w:rPr/>
+      </w:r>
+    </w:p>
+    <w:p>
+      <w:pPr>
+        <w:pStyle w:val="Code"/>
+        <w:rPr/>
+      </w:pPr>
+      <w:r>
+        <w:rPr/>
+        <w:t>class DoctorList(generic.ListView):</w:t>
+      </w:r>
+    </w:p>
+    <w:p>
+      <w:pPr>
+        <w:pStyle w:val="Code"/>
+        <w:rPr/>
+      </w:pPr>
+      <w:r>
+        <w:rPr/>
+        <w:t xml:space="preserve">    </w:t>
+      </w:r>
+      <w:r>
+        <w:rPr/>
+        <w:t>model = Doctor</w:t>
+      </w:r>
+    </w:p>
+    <w:p>
+      <w:pPr>
+        <w:pStyle w:val="Code"/>
+        <w:rPr/>
+      </w:pPr>
+      <w:r>
+        <w:rPr/>
+      </w:r>
+    </w:p>
+    <w:p>
+      <w:pPr>
+        <w:pStyle w:val="Code"/>
+        <w:rPr/>
+      </w:pPr>
+      <w:r>
+        <w:rPr/>
+      </w:r>
+    </w:p>
+    <w:p>
+      <w:pPr>
+        <w:pStyle w:val="Code"/>
+        <w:rPr/>
+      </w:pPr>
+      <w:r>
+        <w:rPr/>
+        <w:t>class DoctorDelete(generic.DeleteView):</w:t>
+      </w:r>
+    </w:p>
+    <w:p>
+      <w:pPr>
+        <w:pStyle w:val="Code"/>
+        <w:rPr/>
+      </w:pPr>
+      <w:r>
+        <w:rPr/>
+        <w:t xml:space="preserve">    </w:t>
+      </w:r>
+      <w:r>
+        <w:rPr/>
+        <w:t>model = Doctor</w:t>
+      </w:r>
+    </w:p>
+    <w:p>
+      <w:pPr>
+        <w:pStyle w:val="Code"/>
+        <w:rPr/>
+      </w:pPr>
+      <w:r>
+        <w:rPr/>
+        <w:t xml:space="preserve">    </w:t>
+      </w:r>
+      <w:r>
+        <w:rPr/>
+        <w:t>success_url = "/list"</w:t>
+      </w:r>
+    </w:p>
+    <w:p>
+      <w:pPr>
+        <w:pStyle w:val="p11"/>
+        <w:rPr>
+          <w:lang w:val="en-US"/>
+        </w:rPr>
+      </w:pPr>
+      <w:r>
+        <w:rPr>
+          <w:lang w:val="en-US"/>
+        </w:rPr>
+      </w:r>
+    </w:p>
+    <w:p>
+      <w:pPr>
+        <w:pStyle w:val="H2"/>
+        <w:rPr/>
+      </w:pPr>
+      <w:r>
+        <w:rPr/>
+        <w:t>templates/index.html</w:t>
+      </w:r>
+    </w:p>
+    <w:p>
+      <w:pPr>
+        <w:pStyle w:val="p11"/>
+        <w:rPr>
+          <w:lang w:val="en-US"/>
+        </w:rPr>
+      </w:pPr>
+      <w:r>
+        <w:rPr>
+          <w:lang w:val="en-US"/>
+        </w:rPr>
+      </w:r>
+    </w:p>
+    <w:p>
+      <w:pPr>
+        <w:pStyle w:val="Code"/>
+        <w:rPr/>
+      </w:pPr>
+      <w:r>
+        <w:rPr/>
+        <w:t>&lt;!doctype html&gt;</w:t>
+      </w:r>
+    </w:p>
+    <w:p>
+      <w:pPr>
+        <w:pStyle w:val="Code"/>
+        <w:rPr/>
+      </w:pPr>
+      <w:r>
+        <w:rPr/>
+        <w:t>&lt;html&gt;</w:t>
+      </w:r>
+    </w:p>
+    <w:p>
+      <w:pPr>
+        <w:pStyle w:val="Code"/>
+        <w:rPr/>
+      </w:pPr>
+      <w:r>
+        <w:rPr/>
+        <w:t xml:space="preserve">  </w:t>
+      </w:r>
+      <w:r>
+        <w:rPr/>
+        <w:t>&lt;head&gt;</w:t>
+      </w:r>
+    </w:p>
+    <w:p>
+      <w:pPr>
+        <w:pStyle w:val="Code"/>
+        <w:rPr/>
+      </w:pPr>
+      <w:r>
+        <w:rPr/>
+        <w:t xml:space="preserve">    </w:t>
+      </w:r>
+      <w:r>
+        <w:rPr/>
+        <w:t>&lt;meta charset="UTF-8" /&gt;</w:t>
+      </w:r>
+    </w:p>
+    <w:p>
+      <w:pPr>
+        <w:pStyle w:val="Code"/>
+        <w:rPr/>
+      </w:pPr>
+      <w:r>
+        <w:rPr/>
+        <w:t xml:space="preserve">    </w:t>
+      </w:r>
+      <w:r>
+        <w:rPr/>
+        <w:t>&lt;title&gt;{% block title %}{% endblock title %}&lt;/title&gt;</w:t>
+      </w:r>
+    </w:p>
+    <w:p>
+      <w:pPr>
+        <w:pStyle w:val="Code"/>
+        <w:rPr/>
+      </w:pPr>
+      <w:r>
+        <w:rPr/>
+      </w:r>
+    </w:p>
+    <w:p>
+      <w:pPr>
+        <w:pStyle w:val="Code"/>
+        <w:rPr/>
+      </w:pPr>
+      <w:r>
+        <w:rPr/>
+        <w:t xml:space="preserve">    </w:t>
+      </w:r>
+      <w:r>
+        <w:rPr/>
+        <w:t>&lt;script src="https://cdn.jsdelivr.net/npm/@tailwindcss/browser@4"&gt;&lt;/script&gt;</w:t>
+      </w:r>
+    </w:p>
+    <w:p>
+      <w:pPr>
+        <w:pStyle w:val="Code"/>
+        <w:rPr/>
+      </w:pPr>
+      <w:r>
+        <w:rPr/>
+        <w:t xml:space="preserve">    </w:t>
+      </w:r>
+      <w:r>
+        <w:rPr/>
+        <w:t>&lt;link rel="stylesheet" href="https://cdn.simplecss.org/simple.min.css"&gt;</w:t>
+      </w:r>
+    </w:p>
+    <w:p>
+      <w:pPr>
+        <w:pStyle w:val="Code"/>
+        <w:rPr/>
+      </w:pPr>
+      <w:r>
+        <w:rPr/>
+        <w:t xml:space="preserve">  </w:t>
+      </w:r>
+      <w:r>
+        <w:rPr/>
+        <w:t>&lt;/head&gt;</w:t>
+      </w:r>
+    </w:p>
+    <w:p>
+      <w:pPr>
+        <w:pStyle w:val="Code"/>
+        <w:rPr/>
+      </w:pPr>
+      <w:r>
+        <w:rPr/>
+        <w:t xml:space="preserve">  </w:t>
+      </w:r>
+      <w:r>
+        <w:rPr/>
+        <w:t>&lt;body&gt;</w:t>
+      </w:r>
+    </w:p>
+    <w:p>
+      <w:pPr>
+        <w:pStyle w:val="Code"/>
+        <w:rPr/>
+      </w:pPr>
+      <w:r>
+        <w:rPr/>
+        <w:t xml:space="preserve">    </w:t>
+      </w:r>
+      <w:r>
+        <w:rPr/>
+        <w:t>{% block content %}{% endblock content %}</w:t>
+      </w:r>
+    </w:p>
+    <w:p>
+      <w:pPr>
+        <w:pStyle w:val="Code"/>
+        <w:rPr/>
+      </w:pPr>
+      <w:r>
+        <w:rPr/>
+        <w:t xml:space="preserve">  </w:t>
+      </w:r>
+      <w:r>
+        <w:rPr/>
+        <w:t>&lt;/body&gt;</w:t>
+      </w:r>
+    </w:p>
+    <w:p>
+      <w:pPr>
+        <w:pStyle w:val="Code"/>
+        <w:rPr/>
+      </w:pPr>
+      <w:r>
+        <w:rPr/>
+        <w:t>&lt;/html&gt;</w:t>
+      </w:r>
+    </w:p>
+    <w:p>
+      <w:pPr>
+        <w:pStyle w:val="p11"/>
+        <w:rPr>
+          <w:lang w:val="en-US"/>
+        </w:rPr>
+      </w:pPr>
+      <w:r>
+        <w:rPr>
+          <w:lang w:val="en-US"/>
+        </w:rPr>
+      </w:r>
+    </w:p>
+    <w:p>
+      <w:pPr>
+        <w:pStyle w:val="H2"/>
+        <w:rPr/>
+      </w:pPr>
+      <w:r>
+        <w:rPr/>
+        <w:t>templates/frontend/doctor_confirm_delete.html</w:t>
+      </w:r>
+    </w:p>
+    <w:p>
+      <w:pPr>
+        <w:pStyle w:val="P1"/>
+        <w:rPr/>
+      </w:pPr>
+      <w:r>
+        <w:rPr/>
+      </w:r>
+    </w:p>
+    <w:p>
+      <w:pPr>
+        <w:pStyle w:val="Code"/>
+        <w:rPr/>
+      </w:pPr>
+      <w:r>
+        <w:rPr/>
+        <w:t>{% extends "index.html" %}</w:t>
+      </w:r>
+    </w:p>
+    <w:p>
+      <w:pPr>
+        <w:pStyle w:val="Code"/>
+        <w:rPr/>
+      </w:pPr>
+      <w:r>
+        <w:rPr/>
+      </w:r>
+    </w:p>
+    <w:p>
+      <w:pPr>
+        <w:pStyle w:val="Code"/>
+        <w:rPr/>
+      </w:pPr>
+      <w:r>
+        <w:rPr/>
+        <w:t>{% block title %}Fire a doctor called {{ object|title }}{% endblock title %}</w:t>
+      </w:r>
+    </w:p>
+    <w:p>
+      <w:pPr>
+        <w:pStyle w:val="Code"/>
+        <w:rPr/>
+      </w:pPr>
+      <w:r>
+        <w:rPr/>
+      </w:r>
+    </w:p>
+    <w:p>
+      <w:pPr>
+        <w:pStyle w:val="Code"/>
+        <w:rPr/>
+      </w:pPr>
+      <w:r>
+        <w:rPr/>
+        <w:t>{% block content %}</w:t>
+      </w:r>
+    </w:p>
+    <w:p>
+      <w:pPr>
+        <w:pStyle w:val="Code"/>
+        <w:rPr/>
+      </w:pPr>
+      <w:r>
+        <w:rPr/>
+        <w:t xml:space="preserve">  </w:t>
+      </w:r>
+      <w:r>
+        <w:rPr/>
+        <w:t>&lt;form method="POST"&gt;</w:t>
+      </w:r>
+    </w:p>
+    <w:p>
+      <w:pPr>
+        <w:pStyle w:val="Code"/>
+        <w:rPr/>
+      </w:pPr>
+      <w:r>
+        <w:rPr/>
+        <w:t xml:space="preserve">    </w:t>
+      </w:r>
+      <w:r>
+        <w:rPr/>
+        <w:t>{% csrf_token %}</w:t>
+      </w:r>
+    </w:p>
+    <w:p>
+      <w:pPr>
+        <w:pStyle w:val="Code"/>
+        <w:rPr/>
+      </w:pPr>
+      <w:r>
+        <w:rPr/>
+        <w:t xml:space="preserve">    </w:t>
+      </w:r>
+      <w:r>
+        <w:rPr/>
+        <w:t>&lt;p&gt;Are you sure you want to fire {{ object|title }}?&lt;/p&gt;</w:t>
+      </w:r>
+    </w:p>
+    <w:p>
+      <w:pPr>
+        <w:pStyle w:val="Code"/>
+        <w:rPr/>
+      </w:pPr>
+      <w:r>
+        <w:rPr/>
+        <w:t xml:space="preserve">    </w:t>
+      </w:r>
+      <w:r>
+        <w:rPr/>
+        <w:t>&lt;button type="submit"&gt;Fire&lt;/button&gt;</w:t>
+      </w:r>
+    </w:p>
+    <w:p>
+      <w:pPr>
+        <w:pStyle w:val="Code"/>
+        <w:rPr/>
+      </w:pPr>
+      <w:r>
+        <w:rPr/>
+        <w:t xml:space="preserve">  </w:t>
+      </w:r>
+      <w:r>
+        <w:rPr/>
+        <w:t>&lt;/form&gt;</w:t>
+      </w:r>
+    </w:p>
+    <w:p>
+      <w:pPr>
+        <w:pStyle w:val="Code"/>
+        <w:rPr/>
+      </w:pPr>
+      <w:r>
+        <w:rPr/>
+        <w:t>{% endblock content %}</w:t>
+      </w:r>
+    </w:p>
+    <w:p>
+      <w:pPr>
+        <w:pStyle w:val="P1"/>
+        <w:rPr/>
+      </w:pPr>
+      <w:r>
+        <w:rPr/>
+      </w:r>
+    </w:p>
+    <w:p>
+      <w:pPr>
+        <w:pStyle w:val="H2"/>
+        <w:rPr/>
+      </w:pPr>
+      <w:r>
+        <w:rPr/>
+        <w:t>templates/frontend/doctor_form.html</w:t>
+      </w:r>
+    </w:p>
+    <w:p>
+      <w:pPr>
+        <w:pStyle w:val="P1"/>
+        <w:rPr/>
+      </w:pPr>
+      <w:r>
+        <w:rPr/>
+      </w:r>
+    </w:p>
+    <w:p>
+      <w:pPr>
+        <w:pStyle w:val="Code"/>
+        <w:rPr/>
+      </w:pPr>
+      <w:r>
+        <w:rPr/>
+        <w:t>{% extends "index.html" %}</w:t>
+      </w:r>
+    </w:p>
+    <w:p>
+      <w:pPr>
+        <w:pStyle w:val="Code"/>
+        <w:rPr/>
+      </w:pPr>
+      <w:r>
+        <w:rPr/>
+      </w:r>
+    </w:p>
+    <w:p>
+      <w:pPr>
+        <w:pStyle w:val="Code"/>
+        <w:rPr/>
+      </w:pPr>
+      <w:r>
+        <w:rPr/>
+        <w:t>{% block title %}Hire a new doctor{% endblock title %}</w:t>
+      </w:r>
+    </w:p>
+    <w:p>
+      <w:pPr>
+        <w:pStyle w:val="Code"/>
+        <w:rPr/>
+      </w:pPr>
+      <w:r>
+        <w:rPr/>
+      </w:r>
+    </w:p>
+    <w:p>
+      <w:pPr>
+        <w:pStyle w:val="Code"/>
+        <w:rPr/>
+      </w:pPr>
+      <w:r>
+        <w:rPr/>
+        <w:t>{% block content %}</w:t>
+      </w:r>
+    </w:p>
+    <w:p>
+      <w:pPr>
+        <w:pStyle w:val="Code"/>
+        <w:rPr/>
+      </w:pPr>
+      <w:r>
+        <w:rPr/>
+        <w:t xml:space="preserve">  </w:t>
+      </w:r>
+      <w:r>
+        <w:rPr/>
+        <w:t>&lt;form method="POST"&gt;</w:t>
+      </w:r>
+    </w:p>
+    <w:p>
+      <w:pPr>
+        <w:pStyle w:val="Code"/>
+        <w:rPr/>
+      </w:pPr>
+      <w:r>
+        <w:rPr/>
+        <w:t xml:space="preserve">    </w:t>
+      </w:r>
+      <w:r>
+        <w:rPr/>
+        <w:t>{% csrf_token %}</w:t>
+      </w:r>
+    </w:p>
+    <w:p>
+      <w:pPr>
+        <w:pStyle w:val="Code"/>
+        <w:rPr/>
+      </w:pPr>
+      <w:r>
+        <w:rPr/>
+        <w:t xml:space="preserve">    </w:t>
+      </w:r>
+      <w:r>
+        <w:rPr/>
+        <w:t>{{ form }}</w:t>
+      </w:r>
+    </w:p>
+    <w:p>
+      <w:pPr>
+        <w:pStyle w:val="Code"/>
+        <w:rPr/>
+      </w:pPr>
+      <w:r>
+        <w:rPr/>
+        <w:t xml:space="preserve">    </w:t>
+      </w:r>
+      <w:r>
+        <w:rPr/>
+        <w:t>&lt;button&gt;Hire&lt;/button&gt;</w:t>
+      </w:r>
+    </w:p>
+    <w:p>
+      <w:pPr>
+        <w:pStyle w:val="Code"/>
+        <w:rPr/>
+      </w:pPr>
+      <w:r>
+        <w:rPr/>
+        <w:t xml:space="preserve">  </w:t>
+      </w:r>
+      <w:r>
+        <w:rPr/>
+        <w:t>&lt;/form&gt;</w:t>
+      </w:r>
+    </w:p>
+    <w:p>
+      <w:pPr>
+        <w:pStyle w:val="Code"/>
+        <w:rPr/>
+      </w:pPr>
+      <w:r>
+        <w:rPr/>
+        <w:t>{% endblock content %}</w:t>
+      </w:r>
+    </w:p>
+    <w:p>
+      <w:pPr>
+        <w:pStyle w:val="P1"/>
+        <w:rPr/>
+      </w:pPr>
+      <w:r>
+        <w:rPr/>
+      </w:r>
+    </w:p>
+    <w:p>
+      <w:pPr>
+        <w:pStyle w:val="H2"/>
+        <w:rPr/>
+      </w:pPr>
+      <w:r>
+        <w:rPr/>
+        <w:t>templates/frontend/doctor_list.html</w:t>
+      </w:r>
+    </w:p>
+    <w:p>
+      <w:pPr>
+        <w:pStyle w:val="P1"/>
+        <w:rPr/>
+      </w:pPr>
+      <w:r>
+        <w:rPr/>
+      </w:r>
+    </w:p>
+    <w:p>
+      <w:pPr>
+        <w:pStyle w:val="Code"/>
+        <w:rPr/>
+      </w:pPr>
+      <w:r>
+        <w:rPr/>
+        <w:t>{% extends "index.html" %}</w:t>
+      </w:r>
+    </w:p>
+    <w:p>
+      <w:pPr>
+        <w:pStyle w:val="Code"/>
+        <w:rPr/>
+      </w:pPr>
+      <w:r>
+        <w:rPr/>
+      </w:r>
+    </w:p>
+    <w:p>
+      <w:pPr>
+        <w:pStyle w:val="Code"/>
+        <w:rPr/>
+      </w:pPr>
+      <w:r>
+        <w:rPr/>
+        <w:t>{% block title %}See available doctors{% endblock title %}</w:t>
+      </w:r>
+    </w:p>
+    <w:p>
+      <w:pPr>
+        <w:pStyle w:val="Code"/>
+        <w:rPr/>
+      </w:pPr>
+      <w:r>
+        <w:rPr/>
+      </w:r>
+    </w:p>
+    <w:p>
+      <w:pPr>
+        <w:pStyle w:val="Code"/>
+        <w:rPr/>
+      </w:pPr>
+      <w:r>
+        <w:rPr/>
+        <w:t>{% block content %}</w:t>
+      </w:r>
+    </w:p>
+    <w:p>
+      <w:pPr>
+        <w:pStyle w:val="Code"/>
+        <w:rPr/>
+      </w:pPr>
+      <w:r>
+        <w:rPr/>
+        <w:t>{% if object_list %}</w:t>
+      </w:r>
+    </w:p>
+    <w:p>
+      <w:pPr>
+        <w:pStyle w:val="Code"/>
+        <w:rPr/>
+      </w:pPr>
+      <w:r>
+        <w:rPr/>
+        <w:t xml:space="preserve">  </w:t>
+      </w:r>
+      <w:r>
+        <w:rPr/>
+        <w:t>&lt;table&gt;</w:t>
+      </w:r>
+    </w:p>
+    <w:p>
+      <w:pPr>
+        <w:pStyle w:val="Code"/>
+        <w:rPr/>
+      </w:pPr>
+      <w:r>
+        <w:rPr/>
+        <w:t xml:space="preserve">    </w:t>
+      </w:r>
+      <w:r>
+        <w:rPr/>
+        <w:t>&lt;thead&gt;</w:t>
+      </w:r>
+    </w:p>
+    <w:p>
+      <w:pPr>
+        <w:pStyle w:val="Code"/>
+        <w:rPr/>
+      </w:pPr>
+      <w:r>
+        <w:rPr/>
+        <w:t xml:space="preserve">      </w:t>
+      </w:r>
+      <w:r>
+        <w:rPr/>
+        <w:t>&lt;th&gt;Name&lt;/th&gt;</w:t>
+      </w:r>
+    </w:p>
+    <w:p>
+      <w:pPr>
+        <w:pStyle w:val="Code"/>
+        <w:rPr/>
+      </w:pPr>
+      <w:r>
+        <w:rPr/>
+        <w:t xml:space="preserve">      </w:t>
+      </w:r>
+      <w:r>
+        <w:rPr/>
+        <w:t>&lt;th&gt;Actions&lt;/th&gt;</w:t>
+      </w:r>
+    </w:p>
+    <w:p>
+      <w:pPr>
+        <w:pStyle w:val="Code"/>
+        <w:rPr/>
+      </w:pPr>
+      <w:r>
+        <w:rPr/>
+        <w:t xml:space="preserve">    </w:t>
+      </w:r>
+      <w:r>
+        <w:rPr/>
+        <w:t>&lt;/thead&gt;</w:t>
+      </w:r>
+    </w:p>
+    <w:p>
+      <w:pPr>
+        <w:pStyle w:val="Code"/>
+        <w:rPr/>
+      </w:pPr>
+      <w:r>
+        <w:rPr/>
+        <w:t xml:space="preserve">    </w:t>
+      </w:r>
+      <w:r>
+        <w:rPr/>
+        <w:t>&lt;tbody&gt;</w:t>
+      </w:r>
+    </w:p>
+    <w:p>
+      <w:pPr>
+        <w:pStyle w:val="Code"/>
+        <w:rPr/>
+      </w:pPr>
+      <w:r>
+        <w:rPr/>
+        <w:t xml:space="preserve">      </w:t>
+      </w:r>
+      <w:r>
+        <w:rPr/>
+        <w:t>{% for doctor in object_list %}</w:t>
+      </w:r>
+    </w:p>
+    <w:p>
+      <w:pPr>
+        <w:pStyle w:val="Code"/>
+        <w:rPr/>
+      </w:pPr>
+      <w:r>
+        <w:rPr/>
+        <w:t xml:space="preserve">        </w:t>
+      </w:r>
+      <w:r>
+        <w:rPr/>
+        <w:t>&lt;tr&gt;</w:t>
+      </w:r>
+    </w:p>
+    <w:p>
+      <w:pPr>
+        <w:pStyle w:val="Code"/>
+        <w:rPr/>
+      </w:pPr>
+      <w:r>
+        <w:rPr/>
+        <w:t xml:space="preserve">          </w:t>
+      </w:r>
+      <w:r>
+        <w:rPr/>
+        <w:t>&lt;td&gt;{{ doctor.full_name|title }}&lt;/td&gt;</w:t>
+      </w:r>
+    </w:p>
+    <w:p>
+      <w:pPr>
+        <w:pStyle w:val="Code"/>
+        <w:rPr/>
+      </w:pPr>
+      <w:r>
+        <w:rPr/>
+        <w:t xml:space="preserve">          </w:t>
+      </w:r>
+      <w:r>
+        <w:rPr/>
+        <w:t>&lt;td&gt;</w:t>
+      </w:r>
+    </w:p>
+    <w:p>
+      <w:pPr>
+        <w:pStyle w:val="Code"/>
+        <w:rPr/>
+      </w:pPr>
+      <w:r>
+        <w:rPr/>
+        <w:t xml:space="preserve">            </w:t>
+      </w:r>
+      <w:r>
+        <w:rPr/>
+        <w:t>&lt;a href="{% url "delete" doctor.id %}"&gt;Fire&lt;/a&gt;</w:t>
+      </w:r>
+    </w:p>
+    <w:p>
+      <w:pPr>
+        <w:pStyle w:val="Code"/>
+        <w:rPr/>
+      </w:pPr>
+      <w:r>
+        <w:rPr/>
+        <w:t xml:space="preserve">          </w:t>
+      </w:r>
+      <w:r>
+        <w:rPr/>
+        <w:t>&lt;/td&gt;</w:t>
+      </w:r>
+    </w:p>
+    <w:p>
+      <w:pPr>
+        <w:pStyle w:val="Code"/>
+        <w:rPr/>
+      </w:pPr>
+      <w:r>
+        <w:rPr/>
+        <w:t xml:space="preserve">        </w:t>
+      </w:r>
+      <w:r>
+        <w:rPr/>
+        <w:t>&lt;/tr&gt;</w:t>
+      </w:r>
+    </w:p>
+    <w:p>
+      <w:pPr>
+        <w:pStyle w:val="Code"/>
+        <w:rPr/>
+      </w:pPr>
+      <w:r>
+        <w:rPr/>
+        <w:t xml:space="preserve">      </w:t>
+      </w:r>
+      <w:r>
+        <w:rPr/>
+        <w:t>{% endfor %}</w:t>
+      </w:r>
+    </w:p>
+    <w:p>
+      <w:pPr>
+        <w:pStyle w:val="Code"/>
+        <w:rPr/>
+      </w:pPr>
+      <w:r>
+        <w:rPr/>
+        <w:t xml:space="preserve">    </w:t>
+      </w:r>
+      <w:r>
+        <w:rPr/>
+        <w:t>&lt;/tbody&gt;</w:t>
+      </w:r>
+    </w:p>
+    <w:p>
+      <w:pPr>
+        <w:pStyle w:val="Code"/>
+        <w:rPr/>
+      </w:pPr>
+      <w:r>
+        <w:rPr/>
+        <w:t xml:space="preserve">  </w:t>
+      </w:r>
+      <w:r>
+        <w:rPr/>
+        <w:t>&lt;/table&gt;</w:t>
+      </w:r>
+    </w:p>
+    <w:p>
+      <w:pPr>
+        <w:pStyle w:val="Code"/>
+        <w:rPr/>
+      </w:pPr>
+      <w:r>
+        <w:rPr/>
+        <w:t>{% else %}</w:t>
+      </w:r>
+    </w:p>
+    <w:p>
+      <w:pPr>
+        <w:pStyle w:val="Code"/>
+        <w:rPr/>
+      </w:pPr>
+      <w:r>
+        <w:rPr/>
+        <w:t>&lt;p&gt;No doctors hired yet.&lt;/p&gt;</w:t>
+      </w:r>
+    </w:p>
+    <w:p>
+      <w:pPr>
+        <w:pStyle w:val="Code"/>
+        <w:rPr/>
+      </w:pPr>
+      <w:r>
+        <w:rPr/>
+        <w:t>{% endif %}</w:t>
+      </w:r>
+    </w:p>
+    <w:p>
+      <w:pPr>
+        <w:pStyle w:val="Code"/>
+        <w:rPr/>
+      </w:pPr>
+      <w:r>
+        <w:rPr/>
+      </w:r>
+    </w:p>
+    <w:p>
+      <w:pPr>
+        <w:pStyle w:val="Code"/>
+        <w:rPr/>
+      </w:pPr>
+      <w:r>
+        <w:rPr/>
+        <w:t>&lt;a href="{% url "create" %}"&gt;Hire a new doctor&lt;/a&gt;</w:t>
+      </w:r>
+    </w:p>
+    <w:p>
+      <w:pPr>
+        <w:pStyle w:val="Code"/>
+        <w:rPr/>
+      </w:pPr>
+      <w:r>
+        <w:rPr/>
+        <w:t>{% endblock content %}</w:t>
+      </w:r>
+    </w:p>
+    <w:p>
+      <w:pPr>
+        <w:pStyle w:val="P1"/>
+        <w:rPr/>
+      </w:pPr>
+      <w:r>
+        <w:rPr/>
+      </w:r>
+    </w:p>
+    <w:p>
+      <w:pPr>
         <w:pStyle w:val="h11"/>
         <w:rPr/>
       </w:pPr>
       <w:r>
         <w:rPr/>
         <w:t>Результати</w:t>
+      </w:r>
+    </w:p>
+    <w:p>
+      <w:pPr>
+        <w:pStyle w:val="p11"/>
+        <w:rPr/>
+      </w:pPr>
+      <w:r>
+        <w:rPr/>
+      </w:r>
+    </w:p>
+    <w:p>
+      <w:pPr>
+        <w:pStyle w:val="p11"/>
+        <w:rPr/>
+      </w:pPr>
+      <w:r>
+        <w:rPr/>
+        <w:t>Коли користувач вперше запускає застосунок, він бачить наступне:</w:t>
+      </w:r>
+    </w:p>
+    <w:p>
+      <w:pPr>
+        <w:pStyle w:val="p11"/>
+        <w:rPr/>
+      </w:pPr>
+      <w:r>
+        <w:rPr/>
+      </w:r>
+    </w:p>
+    <w:p>
+      <w:pPr>
+        <w:pStyle w:val="img1"/>
+        <w:rPr/>
+      </w:pPr>
+      <w:r>
+        <w:rPr/>
+        <w:drawing>
+          <wp:inline distT="0" distB="0" distL="0" distR="0">
+            <wp:extent cx="3797300" cy="1835150"/>
+            <wp:effectExtent l="0" t="0" r="0" b="0"/>
+            <wp:docPr id="1" name="Зображення1"/>
+            <wp:cNvGraphicFramePr>
+              <a:graphicFrameLocks xmlns:a="http://schemas.openxmlformats.org/drawingml/2006/main" noChangeAspect="1"/>
+            </wp:cNvGraphicFramePr>
+            <a:graphic xmlns:a="http://schemas.openxmlformats.org/drawingml/2006/main">
+              <a:graphicData uri="http://schemas.openxmlformats.org/drawingml/2006/picture">
+                <pic:pic xmlns:pic="http://schemas.openxmlformats.org/drawingml/2006/picture">
+                  <pic:nvPicPr>
+                    <pic:cNvPr id="1" name="Зображення1"/>
+                    <pic:cNvPicPr>
+                      <a:picLocks noChangeAspect="1" noChangeArrowheads="1"/>
+                    </pic:cNvPicPr>
+                  </pic:nvPicPr>
+                  <pic:blipFill>
+                    <a:blip r:embed="rId2"/>
+                    <a:stretch>
+                      <a:fillRect/>
+                    </a:stretch>
+                  </pic:blipFill>
+                  <pic:spPr bwMode="auto">
+                    <a:xfrm>
+                      <a:off x="0" y="0"/>
+                      <a:ext cx="3797300" cy="1835150"/>
+                    </a:xfrm>
+                    <a:prstGeom prst="rect">
+                      <a:avLst/>
+                    </a:prstGeom>
+                    <a:noFill/>
+                  </pic:spPr>
+                </pic:pic>
+              </a:graphicData>
+            </a:graphic>
+          </wp:inline>
+        </w:drawing>
+      </w:r>
+    </w:p>
+    <w:p>
+      <w:pPr>
+        <w:pStyle w:val="img1"/>
+        <w:rPr/>
+      </w:pPr>
+      <w:r>
+        <w:rPr/>
+        <w:t>Рисунок 1.1 — Вигляд нового застосунку</w:t>
+      </w:r>
+    </w:p>
+    <w:p>
+      <w:pPr>
+        <w:pStyle w:val="p11"/>
+        <w:rPr/>
+      </w:pPr>
+      <w:r>
+        <w:rPr/>
+      </w:r>
+    </w:p>
+    <w:p>
+      <w:pPr>
+        <w:pStyle w:val="p11"/>
+        <w:rPr/>
+      </w:pPr>
+      <w:r>
+        <w:rPr/>
+        <w:t>По натисканню кнопки «</w:t>
+      </w:r>
+      <w:r>
+        <w:rPr>
+          <w:lang w:val="en-US"/>
+        </w:rPr>
+        <w:t>Hire a new doctor</w:t>
+      </w:r>
+      <w:r>
+        <w:rPr/>
+        <w:t xml:space="preserve">» </w:t>
+      </w:r>
+      <w:r>
+        <w:rPr>
+          <w:lang w:val="uk-UA"/>
+        </w:rPr>
+        <w:t>відображається така сторінка:</w:t>
+      </w:r>
+    </w:p>
+    <w:p>
+      <w:pPr>
+        <w:pStyle w:val="img1"/>
+        <w:rPr/>
+      </w:pPr>
+      <w:r>
+        <w:rPr/>
+      </w:r>
+    </w:p>
+    <w:p>
+      <w:pPr>
+        <w:pStyle w:val="img1"/>
+        <w:rPr/>
+      </w:pPr>
+      <w:r>
+        <w:rPr/>
+        <w:drawing>
+          <wp:inline distT="0" distB="0" distL="0" distR="0">
+            <wp:extent cx="5075555" cy="1429385"/>
+            <wp:effectExtent l="0" t="0" r="0" b="0"/>
+            <wp:docPr id="2" name="Зображення2"/>
+            <wp:cNvGraphicFramePr>
+              <a:graphicFrameLocks xmlns:a="http://schemas.openxmlformats.org/drawingml/2006/main" noChangeAspect="1"/>
+            </wp:cNvGraphicFramePr>
+            <a:graphic xmlns:a="http://schemas.openxmlformats.org/drawingml/2006/main">
+              <a:graphicData uri="http://schemas.openxmlformats.org/drawingml/2006/picture">
+                <pic:pic xmlns:pic="http://schemas.openxmlformats.org/drawingml/2006/picture">
+                  <pic:nvPicPr>
+                    <pic:cNvPr id="2" name="Зображення2"/>
+                    <pic:cNvPicPr>
+                      <a:picLocks noChangeAspect="1" noChangeArrowheads="1"/>
+                    </pic:cNvPicPr>
+                  </pic:nvPicPr>
+                  <pic:blipFill>
+                    <a:blip r:embed="rId3"/>
+                    <a:stretch>
+                      <a:fillRect/>
+                    </a:stretch>
+                  </pic:blipFill>
+                  <pic:spPr bwMode="auto">
+                    <a:xfrm>
+                      <a:off x="0" y="0"/>
+                      <a:ext cx="5075555" cy="1429385"/>
+                    </a:xfrm>
+                    <a:prstGeom prst="rect">
+                      <a:avLst/>
+                    </a:prstGeom>
+                    <a:noFill/>
+                  </pic:spPr>
+                </pic:pic>
+              </a:graphicData>
+            </a:graphic>
+          </wp:inline>
+        </w:drawing>
+      </w:r>
+    </w:p>
+    <w:p>
+      <w:pPr>
+        <w:pStyle w:val="img1"/>
+        <w:rPr/>
+      </w:pPr>
+      <w:r>
+        <w:rPr/>
+        <w:t>Рисунок 1.2 — Вигляд сторінки наймання нового лікаря</w:t>
+      </w:r>
+    </w:p>
+    <w:p>
+      <w:pPr>
+        <w:pStyle w:val="p11"/>
+        <w:rPr>
+          <w:lang w:val="uk-UA"/>
+        </w:rPr>
+      </w:pPr>
+      <w:r>
+        <w:rPr>
+          <w:lang w:val="uk-UA"/>
+        </w:rPr>
+      </w:r>
+    </w:p>
+    <w:p>
+      <w:pPr>
+        <w:pStyle w:val="p11"/>
+        <w:rPr>
+          <w:lang w:val="uk-UA"/>
+        </w:rPr>
+      </w:pPr>
+      <w:r>
+        <w:rPr>
+          <w:lang w:val="uk-UA"/>
+        </w:rPr>
+        <w:t>Після успішного заповнення форми користувач перенаправляється на домашню сторінку. Вона змінює свій вигляд на наступну:</w:t>
+      </w:r>
+    </w:p>
+    <w:p>
+      <w:pPr>
+        <w:pStyle w:val="img1"/>
+        <w:rPr/>
+      </w:pPr>
+      <w:r>
+        <w:rPr/>
+      </w:r>
+    </w:p>
+    <w:p>
+      <w:pPr>
+        <w:pStyle w:val="img1"/>
+        <w:rPr/>
+      </w:pPr>
+      <w:r>
+        <w:rPr/>
+        <w:drawing>
+          <wp:inline distT="0" distB="0" distL="0" distR="0">
+            <wp:extent cx="5731510" cy="1823085"/>
+            <wp:effectExtent l="0" t="0" r="0" b="0"/>
+            <wp:docPr id="3" name="Зображення3"/>
+            <wp:cNvGraphicFramePr>
+              <a:graphicFrameLocks xmlns:a="http://schemas.openxmlformats.org/drawingml/2006/main" noChangeAspect="1"/>
+            </wp:cNvGraphicFramePr>
+            <a:graphic xmlns:a="http://schemas.openxmlformats.org/drawingml/2006/main">
+              <a:graphicData uri="http://schemas.openxmlformats.org/drawingml/2006/picture">
+                <pic:pic xmlns:pic="http://schemas.openxmlformats.org/drawingml/2006/picture">
+                  <pic:nvPicPr>
+                    <pic:cNvPr id="3" name="Зображення3"/>
+                    <pic:cNvPicPr>
+                      <a:picLocks noChangeAspect="1" noChangeArrowheads="1"/>
+                    </pic:cNvPicPr>
+                  </pic:nvPicPr>
+                  <pic:blipFill>
+                    <a:blip r:embed="rId4"/>
+                    <a:stretch>
+                      <a:fillRect/>
+                    </a:stretch>
+                  </pic:blipFill>
+                  <pic:spPr bwMode="auto">
+                    <a:xfrm>
+                      <a:off x="0" y="0"/>
+                      <a:ext cx="5731510" cy="1823085"/>
+                    </a:xfrm>
+                    <a:prstGeom prst="rect">
+                      <a:avLst/>
+                    </a:prstGeom>
+                    <a:noFill/>
+                  </pic:spPr>
+                </pic:pic>
+              </a:graphicData>
+            </a:graphic>
+          </wp:inline>
+        </w:drawing>
+      </w:r>
+    </w:p>
+    <w:p>
+      <w:pPr>
+        <w:pStyle w:val="img1"/>
+        <w:rPr/>
+      </w:pPr>
+      <w:r>
+        <w:rPr/>
+        <w:t>Рисунок 1.3 — Вигляд сторінки лікарів після додавання нового</w:t>
+      </w:r>
+    </w:p>
+    <w:p>
+      <w:pPr>
+        <w:pStyle w:val="p11"/>
+        <w:rPr>
+          <w:lang w:val="uk-UA"/>
+        </w:rPr>
+      </w:pPr>
+      <w:r>
+        <w:rPr>
+          <w:lang w:val="uk-UA"/>
+        </w:rPr>
+      </w:r>
+    </w:p>
+    <w:p>
+      <w:pPr>
+        <w:pStyle w:val="p11"/>
+        <w:rPr>
+          <w:lang w:val="uk-UA"/>
+        </w:rPr>
+      </w:pPr>
+      <w:r>
+        <w:rPr>
+          <w:lang w:val="uk-UA"/>
+        </w:rPr>
+        <w:t>По натисканню кнопки «</w:t>
+      </w:r>
+      <w:r>
+        <w:rPr>
+          <w:lang w:val="en-US"/>
+        </w:rPr>
+        <w:t>Fire</w:t>
+      </w:r>
+      <w:r>
+        <w:rPr>
+          <w:lang w:val="uk-UA"/>
+        </w:rPr>
+        <w:t>» користувача перенаправляє на наступну сторінку:</w:t>
+      </w:r>
+    </w:p>
+    <w:p>
+      <w:pPr>
+        <w:pStyle w:val="img1"/>
+        <w:rPr/>
+      </w:pPr>
+      <w:r>
+        <w:rPr/>
+      </w:r>
+    </w:p>
+    <w:p>
+      <w:pPr>
+        <w:pStyle w:val="img1"/>
+        <w:rPr/>
+      </w:pPr>
+      <w:r>
+        <w:rPr/>
+        <w:drawing>
+          <wp:inline distT="0" distB="0" distL="0" distR="0">
+            <wp:extent cx="5731510" cy="1696720"/>
+            <wp:effectExtent l="0" t="0" r="0" b="0"/>
+            <wp:docPr id="4" name="Зображення4"/>
+            <wp:cNvGraphicFramePr>
+              <a:graphicFrameLocks xmlns:a="http://schemas.openxmlformats.org/drawingml/2006/main" noChangeAspect="1"/>
+            </wp:cNvGraphicFramePr>
+            <a:graphic xmlns:a="http://schemas.openxmlformats.org/drawingml/2006/main">
+              <a:graphicData uri="http://schemas.openxmlformats.org/drawingml/2006/picture">
+                <pic:pic xmlns:pic="http://schemas.openxmlformats.org/drawingml/2006/picture">
+                  <pic:nvPicPr>
+                    <pic:cNvPr id="4" name="Зображення4"/>
+                    <pic:cNvPicPr>
+                      <a:picLocks noChangeAspect="1" noChangeArrowheads="1"/>
+                    </pic:cNvPicPr>
+                  </pic:nvPicPr>
+                  <pic:blipFill>
+                    <a:blip r:embed="rId5"/>
+                    <a:stretch>
+                      <a:fillRect/>
+                    </a:stretch>
+                  </pic:blipFill>
+                  <pic:spPr bwMode="auto">
+                    <a:xfrm>
+                      <a:off x="0" y="0"/>
+                      <a:ext cx="5731510" cy="1696720"/>
+                    </a:xfrm>
+                    <a:prstGeom prst="rect">
+                      <a:avLst/>
+                    </a:prstGeom>
+                    <a:noFill/>
+                  </pic:spPr>
+                </pic:pic>
+              </a:graphicData>
+            </a:graphic>
+          </wp:inline>
+        </w:drawing>
+      </w:r>
+    </w:p>
+    <w:p>
+      <w:pPr>
+        <w:pStyle w:val="img1"/>
+        <w:rPr/>
+      </w:pPr>
+      <w:r>
+        <w:rPr/>
+        <w:t>Рисунок 1.4 — Сторінка підтвердження звільнення лікаря</w:t>
+      </w:r>
+    </w:p>
+    <w:p>
+      <w:pPr>
+        <w:pStyle w:val="p11"/>
+        <w:rPr>
+          <w:lang w:val="uk-UA"/>
+        </w:rPr>
+      </w:pPr>
+      <w:r>
+        <w:rPr>
+          <w:lang w:val="uk-UA"/>
+        </w:rPr>
+      </w:r>
+    </w:p>
+    <w:p>
+      <w:pPr>
+        <w:pStyle w:val="p11"/>
+        <w:rPr>
+          <w:lang w:val="uk-UA"/>
+        </w:rPr>
+      </w:pPr>
+      <w:r>
+        <w:rPr>
+          <w:lang w:val="uk-UA"/>
+        </w:rPr>
+        <w:t>Після натискання кнопки «</w:t>
+      </w:r>
+      <w:r>
+        <w:rPr>
+          <w:lang w:val="en-US"/>
+        </w:rPr>
+        <w:t>Fire</w:t>
+      </w:r>
+      <w:r>
+        <w:rPr>
+          <w:lang w:val="uk-UA"/>
+        </w:rPr>
+        <w:t>» користувача знову перенаправляє на головну сторінку, яка тепер має наступний вигляд:</w:t>
+      </w:r>
+    </w:p>
+    <w:p>
+      <w:pPr>
+        <w:pStyle w:val="p11"/>
+        <w:rPr>
+          <w:lang w:val="uk-UA"/>
+        </w:rPr>
+      </w:pPr>
+      <w:r>
+        <w:rPr>
+          <w:lang w:val="uk-UA"/>
+        </w:rPr>
+      </w:r>
+    </w:p>
+    <w:p>
+      <w:pPr>
+        <w:pStyle w:val="img1"/>
+        <w:rPr/>
+      </w:pPr>
+      <w:r>
+        <w:rPr/>
+        <w:drawing>
+          <wp:inline distT="0" distB="0" distL="0" distR="0">
+            <wp:extent cx="3797300" cy="1835150"/>
+            <wp:effectExtent l="0" t="0" r="0" b="0"/>
+            <wp:docPr id="5" name="Зображення1 копія 1"/>
+            <wp:cNvGraphicFramePr>
+              <a:graphicFrameLocks xmlns:a="http://schemas.openxmlformats.org/drawingml/2006/main" noChangeAspect="1"/>
+            </wp:cNvGraphicFramePr>
+            <a:graphic xmlns:a="http://schemas.openxmlformats.org/drawingml/2006/main">
+              <a:graphicData uri="http://schemas.openxmlformats.org/drawingml/2006/picture">
+                <pic:pic xmlns:pic="http://schemas.openxmlformats.org/drawingml/2006/picture">
+                  <pic:nvPicPr>
+                    <pic:cNvPr id="5" name="Зображення1 копія 1"/>
+                    <pic:cNvPicPr>
+                      <a:picLocks noChangeAspect="1" noChangeArrowheads="1"/>
+                    </pic:cNvPicPr>
+                  </pic:nvPicPr>
+                  <pic:blipFill>
+                    <a:blip r:embed="rId6"/>
+                    <a:stretch>
+                      <a:fillRect/>
+                    </a:stretch>
+                  </pic:blipFill>
+                  <pic:spPr bwMode="auto">
+                    <a:xfrm>
+                      <a:off x="0" y="0"/>
+                      <a:ext cx="3797300" cy="1835150"/>
+                    </a:xfrm>
+                    <a:prstGeom prst="rect">
+                      <a:avLst/>
+                    </a:prstGeom>
+                    <a:noFill/>
+                  </pic:spPr>
+                </pic:pic>
+              </a:graphicData>
+            </a:graphic>
+          </wp:inline>
+        </w:drawing>
+      </w:r>
+    </w:p>
+    <w:p>
+      <w:pPr>
+        <w:pStyle w:val="img1"/>
+        <w:rPr/>
+      </w:pPr>
+      <w:r>
+        <w:rPr/>
+        <w:t>Рисунок 1.5 — Вигляд нового застосунку</w:t>
+      </w:r>
+    </w:p>
+    <w:p>
+      <w:pPr>
+        <w:pStyle w:val="p11"/>
+        <w:rPr>
+          <w:lang w:val="uk-UA"/>
+        </w:rPr>
+      </w:pPr>
+      <w:r>
+        <w:rPr>
+          <w:lang w:val="uk-UA"/>
+        </w:rPr>
       </w:r>
     </w:p>
     <w:p>

</xml_diff>